<commit_message>
Mejoras a la documentacion
</commit_message>
<xml_diff>
--- a/Documentacion.docx
+++ b/Documentacion.docx
@@ -426,6 +426,7 @@
           <w:ilvl w:val="0"/>
           <w:numId w:val="6"/>
         </w:numPr>
+        <w:jc w:val="both"/>
         <w:rPr>
           <w:rFonts w:ascii="Arial" w:hAnsi="Arial" w:cs="Arial"/>
           <w:sz w:val="24"/>
@@ -448,7 +449,23 @@
           <w:sz w:val="24"/>
           <w:szCs w:val="24"/>
         </w:rPr>
-        <w:t xml:space="preserve"> Homero recorre la casa buscando comprobantes, </w:t>
+        <w:t xml:space="preserve"> Homero recorre la casa buscando comprobantes</w:t>
+      </w:r>
+      <w:r>
+        <w:rPr>
+          <w:rFonts w:ascii="Arial" w:hAnsi="Arial" w:cs="Arial"/>
+          <w:sz w:val="24"/>
+          <w:szCs w:val="24"/>
+        </w:rPr>
+        <w:t xml:space="preserve"> de pago de impuestos</w:t>
+      </w:r>
+      <w:r>
+        <w:rPr>
+          <w:rFonts w:ascii="Arial" w:hAnsi="Arial" w:cs="Arial"/>
+          <w:sz w:val="24"/>
+          <w:szCs w:val="24"/>
+        </w:rPr>
+        <w:t xml:space="preserve">, </w:t>
       </w:r>
       <w:r>
         <w:rPr>
@@ -464,7 +481,7 @@
           <w:sz w:val="24"/>
           <w:szCs w:val="24"/>
         </w:rPr>
-        <w:t xml:space="preserve"> </w:t>
+        <w:t xml:space="preserve"> El jugador va tener tres vidas, el juego tendrá obstáculos el cual le hará perder vidas. </w:t>
       </w:r>
     </w:p>
     <w:p>
@@ -476,6 +493,8 @@
           <w:szCs w:val="24"/>
         </w:rPr>
       </w:pPr>
+      <w:bookmarkStart w:id="0" w:name="_GoBack"/>
+      <w:bookmarkEnd w:id="0"/>
     </w:p>
     <w:p>
       <w:pPr>
@@ -589,6 +608,7 @@
           <w:ilvl w:val="0"/>
           <w:numId w:val="7"/>
         </w:numPr>
+        <w:jc w:val="both"/>
         <w:rPr>
           <w:rFonts w:ascii="Arial" w:hAnsi="Arial" w:cs="Arial"/>
           <w:sz w:val="24"/>
@@ -695,7 +715,7 @@
           <w:sz w:val="24"/>
           <w:szCs w:val="24"/>
         </w:rPr>
-        <w:t xml:space="preserve">Homero le quita el billete a la policía y huye, </w:t>
+        <w:t>H</w:t>
       </w:r>
       <w:r>
         <w:rPr>
@@ -704,10 +724,53 @@
           <w:sz w:val="24"/>
           <w:szCs w:val="24"/>
         </w:rPr>
+        <w:t xml:space="preserve">omero le quita el billete a la policía y huye, </w:t>
+      </w:r>
+      <w:r>
+        <w:rPr>
+          <w:rFonts w:ascii="Arial" w:hAnsi="Arial" w:cs="Arial"/>
+          <w:bCs/>
+          <w:sz w:val="24"/>
+          <w:szCs w:val="24"/>
+        </w:rPr>
         <w:t>debe lograr coger un avión y salir del país antes que los policías lo arresten. Debe llegar a cuba y no dejarse quitar el billete del general.</w:t>
       </w:r>
-      <w:bookmarkStart w:id="0" w:name="_GoBack"/>
-      <w:bookmarkEnd w:id="0"/>
+    </w:p>
+    <w:p>
+      <w:pPr>
+        <w:pStyle w:val="Sinespaciado"/>
+        <w:numPr>
+          <w:ilvl w:val="0"/>
+          <w:numId w:val="11"/>
+        </w:numPr>
+        <w:jc w:val="both"/>
+        <w:rPr>
+          <w:rFonts w:ascii="Arial" w:hAnsi="Arial" w:cs="Arial"/>
+          <w:bCs/>
+          <w:sz w:val="24"/>
+          <w:szCs w:val="24"/>
+        </w:rPr>
+      </w:pPr>
+      <w:r>
+        <w:rPr>
+          <w:rFonts w:ascii="Arial" w:hAnsi="Arial" w:cs="Arial"/>
+          <w:b/>
+          <w:bCs/>
+          <w:sz w:val="24"/>
+          <w:szCs w:val="24"/>
+        </w:rPr>
+        <w:lastRenderedPageBreak/>
+        <w:t>Mecánica de juego:</w:t>
+      </w:r>
+      <w:r>
+        <w:rPr>
+          <w:rFonts w:ascii="Arial" w:hAnsi="Arial" w:cs="Arial"/>
+          <w:bCs/>
+          <w:sz w:val="24"/>
+          <w:szCs w:val="24"/>
+        </w:rPr>
+        <w:t xml:space="preserve"> Homero tiene el billete, empieza a huir con el billete, tiene que pasar algunos obstáculos, no debe dejarse atrapar, luego se encuentra al coronel quien le va quitar el billete o va tratar de quitárselo.</w:t>
+      </w:r>
     </w:p>
     <w:p>
       <w:pPr>

</xml_diff>